<commit_message>
feat: add detailed component connections block diagram in Mermaid, DOT, SVG, and PNG
</commit_message>
<xml_diff>
--- a/final_prd_staging/PRODUCT_REQUIREMENT_DOCUMENT_PRD_FINAL.docx
+++ b/final_prd_staging/PRODUCT_REQUIREMENT_DOCUMENT_PRD_FINAL.docx
@@ -8348,6 +8348,21 @@
         <w:t>Figure 11: MCU System Interaction, State Machine &amp; Monitoring Architecture</w:t>
         <w:tab/>
         <w:t>21</w:t>
+      </w:r>
+    </w:p>
+    <w:p>
+      <w:pPr>
+        <w:spacing w:before="30" w:after="30" w:line="276" w:lineRule="auto"/>
+      </w:pPr>
+      <w:r>
+        <w:rPr>
+          <w:rFonts w:ascii="Calibri" w:hAnsi="Calibri"/>
+          <w:color w:val="2D3748"/>
+          <w:sz w:val="18"/>
+        </w:rPr>
+        <w:t>Figure 12: Detailed Component Connections Block Diagram</w:t>
+        <w:tab/>
+        <w:t>22</w:t>
       </w:r>
     </w:p>
     <w:p>
@@ -32429,6 +32444,68 @@
           <w:sz w:val="17"/>
         </w:rPr>
         <w:t>Figure 11: MCU System Interaction, State Machine &amp; Monitoring Architecture</w:t>
+      </w:r>
+    </w:p>
+    <w:p>
+      <w:pPr>
+        <w:pStyle w:val="Heading2"/>
+      </w:pPr>
+      <w:r>
+        <w:t>8.6 System Interconnect: Detailed Component Connections Block Diagram</w:t>
+      </w:r>
+    </w:p>
+    <w:p>
+      <w:pPr>
+        <w:jc w:val="center"/>
+      </w:pPr>
+      <w:r>
+        <w:drawing>
+          <wp:inline>
+            <wp:extent cx="5916168" cy="3424048"/>
+            <wp:docPr id="15" name="Picture 15"/>
+            <wp:cNvGraphicFramePr>
+              <a:graphicFrameLocks noChangeAspect="1"/>
+            </wp:cNvGraphicFramePr>
+            <a:graphic>
+              <a:graphicData uri="http://schemas.openxmlformats.org/drawingml/2006/picture">
+                <pic:pic>
+                  <pic:nvPicPr>
+                    <pic:cNvPr id="0" name="figure12_detailed_component_connections_block_diagram.png"/>
+                    <pic:cNvPicPr/>
+                  </pic:nvPicPr>
+                  <pic:blipFill>
+                    <a:blip r:embed="rId21"/>
+                    <a:stretch>
+                      <a:fillRect/>
+                    </a:stretch>
+                  </pic:blipFill>
+                  <pic:spPr>
+                    <a:xfrm>
+                      <a:off x="0" y="0"/>
+                      <a:ext cx="5916168" cy="3424048"/>
+                    </a:xfrm>
+                    <a:prstGeom prst="rect"/>
+                  </pic:spPr>
+                </pic:pic>
+              </a:graphicData>
+            </a:graphic>
+          </wp:inline>
+        </w:drawing>
+      </w:r>
+    </w:p>
+    <w:p>
+      <w:pPr>
+        <w:spacing w:before="60" w:after="160"/>
+        <w:jc w:val="center"/>
+      </w:pPr>
+      <w:r>
+        <w:rPr>
+          <w:rFonts w:ascii="Calibri" w:hAnsi="Calibri"/>
+          <w:i/>
+          <w:color w:val="4A5568"/>
+          <w:sz w:val="17"/>
+        </w:rPr>
+        <w:t>Figure 12: Detailed Component Connections Block Diagram</w:t>
       </w:r>
     </w:p>
     <w:p>

</xml_diff>

<commit_message>
feat: trash voltage steering, transition to direct PWM duty cycle voltage control, and regenerate connections diagram
</commit_message>
<xml_diff>
--- a/final_prd_staging/PRODUCT_REQUIREMENT_DOCUMENT_PRD_FINAL.docx
+++ b/final_prd_staging/PRODUCT_REQUIREMENT_DOCUMENT_PRD_FINAL.docx
@@ -7676,7 +7676,7 @@
           <w:color w:val="2D3748"/>
           <w:sz w:val="18"/>
         </w:rPr>
-        <w:t>Table 4.5: Analog Closed-Loop Control, DAC Steering &amp; Hardware Protection Specifications</w:t>
+        <w:t>Table 4.5: Closed-Loop Control, Direct PWM Voltage Control &amp; Hardware Protection Specifications</w:t>
         <w:tab/>
         <w:t>17</w:t>
       </w:r>
@@ -11570,7 +11570,7 @@
         <w:t>The Smart Programmable Power Supply is a 4-stage AC-to-DC conversion and regulation system in which the power stage and mixed-signal microcontroller work together to deliver precise, clean, and safe DC power. The module connects directly to universal grid AC mains (85V–265V AC) through an input protection and EMI filter stage, rectifies it to a high-voltage bulk DC rail (+120V to +375V DC), isolates and steps it down via a Flyback stage to an intermediate +24.0V DC bus (72W), and regulates it through a synchronous 4-switch Buck-Boost stage to provide the commanded 5.0V to 20.0V DC output at up to 3.0A.</w:t>
         <w:br/>
         <w:br/>
-        <w:t>The onboard microcontroller (STM32G474) acts as the system brain by reading dual-domain electrical telemetry (primary AC input power and secondary DC load power), computing real-time conversion efficiency, updating the 1.3-inch OLED dashboard, and driving the precision 12-bit DAC voltage steering network. Circuit protection relies on robust, standard, industry-proven hardware protections: primary AC fuse, inrush NTC, surge MOV, primary cycle-by-cycle Flyback current limiting, and secondary LM5176 built-in cycle-by-cycle overcurrent protection with thermal shutdown.</w:t>
+        <w:t>The onboard microcontroller (STM32G474) acts as the system brain by reading dual-domain electrical telemetry (primary AC input power and secondary DC load power), computing real-time conversion efficiency, updating the 1.3-inch OLED dashboard, and executing direct 300 kHz PWM duty cycle voltage control. Circuit protection relies on robust, standard, industry-proven hardware protections: primary AC fuse, inrush NTC, surge MOV, primary cycle-by-cycle Flyback current limiting, and secondary LM5176 built-in cycle-by-cycle overcurrent protection with thermal shutdown.</w:t>
         <w:br/>
         <w:br/>
         <w:t>In simple terms, the power conversion stages handle the heavy electrical energy flow across certified 3000V RMS galvanic isolation, while the built-in controller protections and MCU provide safety, precision regulation, and live telemetry.</w:t>
@@ -11586,7 +11586,7 @@
         <w:br/>
         <w:t>• Wide Programmable DC Output: 4-switch synchronous Buck-Boost post-regulator delivers 5.0V to 20.0V DC at up to 3.0A continuous (60W continuous power).</w:t>
         <w:br/>
-        <w:t>• High-Resolution DAC Voltage Steering: 12-bit DAC network achieves 10mV monotonic setpoint resolution.</w:t>
+        <w:t>• High-Resolution Direct PWM Voltage Control: STM32G474 high-resolution PWM timer directly commands Buck-Boost duty cycle (D = 20.8% to 83.3%).</w:t>
         <w:br/>
         <w:t>• Built-in Cycle-by-Cycle Hardware Current Limiting: LM5176 monitors output current through a dedicated 10mΩ shunt across its CSP/CSN pins, natively limiting peak inductor current on every switching cycle without external analog complexity.</w:t>
         <w:br/>
@@ -13183,10 +13183,7 @@
         <w:rPr/>
       </w:pPr>
       <w:r>
-        <w:rPr>
-          <w:rtl w:val="0"/>
-        </w:rPr>
-        <w:t xml:space="preserve">The product is designed as a unified Embedded Hardware Power Supply Module (System 1). Primary hardware stages include AC Mains Protection &amp; EMI Filter, GBU606 Bridge Rectifier &amp; Bulk Capacitor (+120V to +375V DC), Stage 1 Isolated Flyback Converter (+24V DC, 72W), Stage 2 Synchronous 4-Switch Buck-Boost Post-Regulator (5V–20V / 3A DC), and Analog DAC Steering &amp; Built-in Hardware Protections.</w:t>
+        <w:t>The product is designed as a unified Embedded Hardware Power Supply Module (System 1). Primary hardware stages include AC Mains Protection &amp; EMI Filter, GBU606 Bridge Rectifier &amp; Bulk Capacitor (+120V to +375V DC), Stage 1 Isolated Flyback Converter (+24V DC, 72W), Stage 2 Synchronous 4-Switch Buck-Boost Post-Regulator (5V–20V / 3A DC), and Direct PWM Duty Cycle Control &amp; Built-in Hardware Protections.</w:t>
       </w:r>
     </w:p>
     <w:p>
@@ -13689,30 +13686,8 @@
             <w:tcW w:w="8380" w:type="dxa"/>
           </w:tcPr>
           <w:p>
-            <w:pPr>
-              <w:spacing w:after="40" w:before="40" w:line="252.00000000000003" w:lineRule="auto"/>
-              <w:jc w:val="left"/>
-              <w:rPr>
-                <w:sz w:val="20"/>
-                <w:szCs w:val="20"/>
-              </w:rPr>
-            </w:pPr>
-            <w:r>
-              <w:rPr>
-                <w:rFonts w:ascii="Arial" w:cs="Arial" w:eastAsia="Arial" w:hAnsi="Arial"/>
-                <w:b w:val="0"/>
-                <w:bCs w:val="0"/>
-                <w:color w:val="000000"/>
-                <w:sz w:val="20"/>
-                <w:szCs w:val="20"/>
-                <w:rtl w:val="0"/>
-              </w:rPr>
-              <w:t xml:space="preserve">High-precision 10 mV digital voltage steering via 12-bit DAC summing network</w:t>
-            </w:r>
-            <w:r>
-              <w:rPr>
-                <w:rtl w:val="0"/>
-              </w:rPr>
+            <w:r>
+              <w:t>High-precision digital voltage regulation via direct PWM duty cycle control</w:t>
             </w:r>
           </w:p>
         </w:tc>
@@ -14225,7 +14200,7 @@
       <w:r>
         <w:drawing>
           <wp:inline>
-            <wp:extent cx="5916168" cy="8445840"/>
+            <wp:extent cx="5916168" cy="5087333"/>
             <wp:docPr id="5" name="Picture 5"/>
             <wp:cNvGraphicFramePr>
               <a:graphicFrameLocks noChangeAspect="1"/>
@@ -14246,7 +14221,7 @@
                   <pic:spPr>
                     <a:xfrm>
                       <a:off x="0" y="0"/>
-                      <a:ext cx="5916168" cy="8445840"/>
+                      <a:ext cx="5916168" cy="5087333"/>
                     </a:xfrm>
                     <a:prstGeom prst="rect"/>
                   </pic:spPr>
@@ -16714,15 +16689,7 @@
         </w:rPr>
       </w:pPr>
       <w:r>
-        <w:rPr>
-          <w:rtl w:val="0"/>
-        </w:rPr>
-        <w:t xml:space="preserve">The SPPS module contains an onboard STM32G474 mixed-signal microcontroller that coordinates telemetry sampling, closed-loop DAC voltage steering, status display, and fault handling. The following table describes the interface, protocol/mode, and usage of each interface:</w:t>
-      </w:r>
-      <w:r>
-        <w:rPr>
-          <w:rtl w:val="0"/>
-        </w:rPr>
+        <w:t>The SPPS module contains an onboard STM32G474 mixed-signal microcontroller that coordinates telemetry sampling, closed-loop digital PWM duty cycle voltage control, status display, and fault handling. The following table describes the interface, protocol/mode, and usage of each interface:</w:t>
       </w:r>
     </w:p>
     <w:tbl>
@@ -17951,30 +17918,8 @@
             <w:tcW w:w="1584" w:type="dxa"/>
           </w:tcPr>
           <w:p>
-            <w:pPr>
-              <w:spacing w:after="40" w:before="40" w:line="252.00000000000003" w:lineRule="auto"/>
-              <w:jc w:val="left"/>
-              <w:rPr>
-                <w:sz w:val="20"/>
-                <w:szCs w:val="20"/>
-              </w:rPr>
-            </w:pPr>
-            <w:r>
-              <w:rPr>
-                <w:rFonts w:ascii="Arial" w:cs="Arial" w:eastAsia="Arial" w:hAnsi="Arial"/>
-                <w:b w:val="0"/>
-                <w:bCs w:val="0"/>
-                <w:color w:val="000000"/>
-                <w:sz w:val="20"/>
-                <w:szCs w:val="20"/>
-                <w:rtl w:val="0"/>
-              </w:rPr>
-              <w:t xml:space="preserve">Voltage Steering</w:t>
-            </w:r>
-            <w:r>
-              <w:rPr>
-                <w:rtl w:val="0"/>
-              </w:rPr>
+            <w:r>
+              <w:t>Direct PWM Control</w:t>
             </w:r>
           </w:p>
         </w:tc>
@@ -26663,15 +26608,7 @@
         </w:rPr>
       </w:pPr>
       <w:r>
-        <w:rPr>
-          <w:rtl w:val="0"/>
-        </w:rPr>
-        <w:t xml:space="preserve">System 2 represents the Secondary Stage 4-Switch Synchronous Buck-Boost Post-Regulator, Analog Closed-Loop Control, DAC Steering Network, and Autonomous Hardware CC Protection Subsystem. The detailed electrical hardware specifications are defined in Table 4.5 below:</w:t>
-      </w:r>
-      <w:r>
-        <w:rPr>
-          <w:rtl w:val="0"/>
-        </w:rPr>
+        <w:t>System 2 represents the Secondary Stage 4-Switch Synchronous Buck-Boost Post-Regulator, Closed-Loop Control, Direct PWM Voltage Control, and Autonomous Hardware CC Protection Subsystem. The detailed electrical hardware specifications are defined in Table 4.5 below:</w:t>
       </w:r>
     </w:p>
     <w:p>
@@ -26708,23 +26645,7 @@
         </w:rPr>
       </w:pPr>
       <w:r>
-        <w:rPr>
-          <w:rFonts w:ascii="Liberation Serif" w:cs="Liberation Serif" w:eastAsia="Liberation Serif" w:hAnsi="Liberation Serif"/>
-          <w:b w:val="0"/>
-          <w:bCs w:val="0"/>
-          <w:i w:val="1"/>
-          <w:iCs w:val="1"/>
-          <w:smallCaps w:val="0"/>
-          <w:strike w:val="0"/>
-          <w:color w:val="00000a"/>
-          <w:sz w:val="24"/>
-          <w:szCs w:val="24"/>
-          <w:u w:val="none"/>
-          <w:shd w:fill="auto" w:val="clear"/>
-          <w:vertAlign w:val="baseline"/>
-          <w:rtl w:val="0"/>
-        </w:rPr>
-        <w:t xml:space="preserve">Table 4.5: Analog Closed-Loop Control, DAC Steering &amp; Hardware Protection Specifications</w:t>
+        <w:t>Table 4.5: Closed-Loop Control, Direct PWM Voltage Control &amp; Hardware Protection Specifications</w:t>
       </w:r>
     </w:p>
     <w:tbl>
@@ -26900,30 +26821,8 @@
             <w:tcW w:w="3600" w:type="dxa"/>
           </w:tcPr>
           <w:p>
-            <w:pPr>
-              <w:spacing w:after="40" w:before="40" w:line="252.00000000000003" w:lineRule="auto"/>
-              <w:jc w:val="left"/>
-              <w:rPr>
-                <w:sz w:val="20"/>
-                <w:szCs w:val="20"/>
-              </w:rPr>
-            </w:pPr>
-            <w:r>
-              <w:rPr>
-                <w:rFonts w:ascii="Arial" w:cs="Arial" w:eastAsia="Arial" w:hAnsi="Arial"/>
-                <w:b w:val="0"/>
-                <w:bCs w:val="0"/>
-                <w:color w:val="000000"/>
-                <w:sz w:val="20"/>
-                <w:szCs w:val="20"/>
-                <w:rtl w:val="0"/>
-              </w:rPr>
-              <w:t xml:space="preserve">DAC Voltage Steering Network</w:t>
-            </w:r>
-            <w:r>
-              <w:rPr>
-                <w:rtl w:val="0"/>
-              </w:rPr>
+            <w:r>
+              <w:t>Direct PWM Duty Cycle Voltage Control</w:t>
             </w:r>
           </w:p>
         </w:tc>
@@ -26933,30 +26832,8 @@
             <w:tcW w:w="4276" w:type="dxa"/>
           </w:tcPr>
           <w:p>
-            <w:pPr>
-              <w:spacing w:after="40" w:before="40" w:line="252.00000000000003" w:lineRule="auto"/>
-              <w:jc w:val="left"/>
-              <w:rPr>
-                <w:sz w:val="20"/>
-                <w:szCs w:val="20"/>
-              </w:rPr>
-            </w:pPr>
-            <w:r>
-              <w:rPr>
-                <w:rFonts w:ascii="Arial" w:cs="Arial" w:eastAsia="Arial" w:hAnsi="Arial"/>
-                <w:b w:val="0"/>
-                <w:bCs w:val="0"/>
-                <w:color w:val="000000"/>
-                <w:sz w:val="20"/>
-                <w:szCs w:val="20"/>
-                <w:rtl w:val="0"/>
-              </w:rPr>
-              <w:t xml:space="preserve">Resistor summing into LM5176 FB node [MUST]</w:t>
-            </w:r>
-            <w:r>
-              <w:rPr>
-                <w:rtl w:val="0"/>
-              </w:rPr>
+            <w:r>
+              <w:t>Direct PWM duty cycle modulation from MCU HRTIM [MUST]</w:t>
             </w:r>
           </w:p>
         </w:tc>
@@ -30203,32 +30080,29 @@
         <w:rPr/>
       </w:pPr>
       <w:r>
-        <w:rPr>
-          <w:rtl w:val="0"/>
-        </w:rPr>
-        <w:t xml:space="preserve">Phase 1 — Requirement &amp; Architecture and Class A BOM:</w:t>
-        <w:br w:type="textWrapping"/>
-        <w:t xml:space="preserve">Definition of functional and electrical requirements; 4-stage system architecture design; block diagram and interface specifications.</w:t>
-        <w:br w:type="textWrapping"/>
-        <w:br w:type="textWrapping"/>
-        <w:t xml:space="preserve">Phase 2 — Component Selection &amp; Circuit Design:</w:t>
-        <w:br w:type="textWrapping"/>
-        <w:t xml:space="preserve">Transformer PQ26/20 magnetics sizing; component stress derating calculations; closed-loop feedback and DAC steering design; companion HDD authoring.</w:t>
-        <w:br w:type="textWrapping"/>
-        <w:br w:type="textWrapping"/>
-        <w:t xml:space="preserve">Phase 3 — Schematic Design and Review:</w:t>
-        <w:br w:type="textWrapping"/>
-        <w:t xml:space="preserve">Complete 4-stage Altium schematics capture; LM5176 cycle-by-cycle current limit sensing and MCU enable control.</w:t>
-        <w:br w:type="textWrapping"/>
-        <w:br w:type="textWrapping"/>
-        <w:t xml:space="preserve">Phase 4 — PCB Layout &amp; DFM Review:</w:t>
-        <w:br w:type="textWrapping"/>
-        <w:t xml:space="preserve">PCB stackup; high-voltage isolation partitioning with 2.0mm milled slot; switching loop routing; DFM/DFA checks.</w:t>
-        <w:br w:type="textWrapping"/>
-        <w:br w:type="textWrapping"/>
-        <w:t xml:space="preserve">Phase 5 — Prototype Bring-up &amp; Design Validation Plan (DVT):</w:t>
-        <w:br w:type="textWrapping"/>
-        <w:t xml:space="preserve">PCB fabrication and assembly (5 units); cold resistance checks; supervised Variac bring-up; line/load regulation, ripple, efficiency, and Hi-Pot validation.</w:t>
+        <w:t>Phase 1 — Requirement &amp; Architecture and Class A BOM:</w:t>
+        <w:br/>
+        <w:t>Definition of functional and electrical requirements; 4-stage system architecture design; block diagram and interface specifications.</w:t>
+        <w:br/>
+        <w:br/>
+        <w:t>Phase 2 — Component Selection &amp; Circuit Design:</w:t>
+        <w:br/>
+        <w:t>Transformer PQ26/20 magnetics sizing; component stress derating calculations; closed-loop feedback and digital PWM control design; companion HDD authoring.</w:t>
+        <w:br/>
+        <w:br/>
+        <w:t>Phase 3 — Schematic Design and Review:</w:t>
+        <w:br/>
+        <w:t>Complete 4-stage Altium schematics capture; LM5176 cycle-by-cycle current limit sensing and MCU enable control.</w:t>
+        <w:br/>
+        <w:br/>
+        <w:t>Phase 4 — PCB Layout &amp; DFM Review:</w:t>
+        <w:br/>
+        <w:t>PCB stackup; high-voltage isolation partitioning with 2.0mm milled slot; switching loop routing; DFM/DFA checks.</w:t>
+        <w:br/>
+        <w:br/>
+        <w:t>Phase 5 — Prototype Bring-up &amp; Design Validation Plan (DVT):</w:t>
+        <w:br/>
+        <w:t>PCB fabrication and assembly (5 units); cold resistance checks; supervised Variac bring-up; line/load regulation, ripple, efficiency, and Hi-Pot validation.</w:t>
       </w:r>
     </w:p>
     <w:p>
@@ -31960,52 +31834,18 @@
             <w:vAlign w:val="center"/>
           </w:tcPr>
           <w:p>
-            <w:pPr>
-              <w:spacing w:after="40" w:before="40" w:line="252.00000000000003" w:lineRule="auto"/>
-              <w:jc w:val="left"/>
-              <w:rPr/>
-            </w:pPr>
-            <w:r>
-              <w:rPr>
-                <w:rFonts w:ascii="Arial" w:cs="Arial" w:eastAsia="Arial" w:hAnsi="Arial"/>
-                <w:b w:val="1"/>
-                <w:bCs w:val="1"/>
-                <w:sz w:val="17"/>
-                <w:szCs w:val="17"/>
-                <w:rtl w:val="0"/>
-              </w:rPr>
-              <w:t xml:space="preserve">Precision DAC Steering</w:t>
-            </w:r>
-            <w:r>
-              <w:rPr>
-                <w:rtl w:val="0"/>
-              </w:rPr>
-            </w:r>
-          </w:p>
-        </w:tc>
-        <w:tc>
-          <w:tcPr>
-            <w:vAlign w:val="center"/>
-          </w:tcPr>
-          <w:p>
-            <w:pPr>
-              <w:spacing w:after="40" w:before="40" w:line="252.00000000000003" w:lineRule="auto"/>
-              <w:jc w:val="left"/>
-              <w:rPr/>
-            </w:pPr>
-            <w:r>
-              <w:rPr>
-                <w:rFonts w:ascii="Arial" w:cs="Arial" w:eastAsia="Arial" w:hAnsi="Arial"/>
-                <w:sz w:val="17"/>
-                <w:szCs w:val="17"/>
-                <w:rtl w:val="0"/>
-              </w:rPr>
-              <w:t xml:space="preserve">Resistor summing network (R_top=49.9kΩ, R_bot=3.65kΩ, R_DAC=11kΩ) steers output from 5V to 20V in 10mV steps.</w:t>
-            </w:r>
-            <w:r>
-              <w:rPr>
-                <w:rtl w:val="0"/>
-              </w:rPr>
+            <w:r>
+              <w:t>Direct PWM Duty Cycle Voltage Control</w:t>
+            </w:r>
+          </w:p>
+        </w:tc>
+        <w:tc>
+          <w:tcPr>
+            <w:vAlign w:val="center"/>
+          </w:tcPr>
+          <w:p>
+            <w:r>
+              <w:t>MCU modulates 300 kHz PWM duty cycle (D = 20.8% for 5V to 83.3% for 20V) to directly command output voltage.</w:t>
             </w:r>
           </w:p>
         </w:tc>
@@ -32107,7 +31947,7 @@
       <w:r>
         <w:drawing>
           <wp:inline>
-            <wp:extent cx="5916168" cy="2726345"/>
+            <wp:extent cx="5916168" cy="2752513"/>
             <wp:docPr id="10" name="Picture 10"/>
             <wp:cNvGraphicFramePr>
               <a:graphicFrameLocks noChangeAspect="1"/>
@@ -32128,7 +31968,7 @@
                   <pic:spPr>
                     <a:xfrm>
                       <a:off x="0" y="0"/>
-                      <a:ext cx="5916168" cy="2726345"/>
+                      <a:ext cx="5916168" cy="2752513"/>
                     </a:xfrm>
                     <a:prstGeom prst="rect"/>
                   </pic:spPr>
@@ -32461,7 +32301,7 @@
       <w:r>
         <w:drawing>
           <wp:inline>
-            <wp:extent cx="5916168" cy="3424048"/>
+            <wp:extent cx="5916168" cy="3328591"/>
             <wp:docPr id="15" name="Picture 15"/>
             <wp:cNvGraphicFramePr>
               <a:graphicFrameLocks noChangeAspect="1"/>
@@ -32482,7 +32322,7 @@
                   <pic:spPr>
                     <a:xfrm>
                       <a:off x="0" y="0"/>
-                      <a:ext cx="5916168" cy="3424048"/>
+                      <a:ext cx="5916168" cy="3328591"/>
                     </a:xfrm>
                     <a:prstGeom prst="rect"/>
                   </pic:spPr>
@@ -40626,7 +40466,7 @@
                 <w:color w:val="1A202C"/>
                 <w:sz w:val="16"/>
               </w:rPr>
-              <w:t>R_DAC</w:t>
+              <w:t>R_FB_DIV</w:t>
             </w:r>
           </w:p>
         </w:tc>
@@ -40655,7 +40495,7 @@
                 <w:color w:val="1A202C"/>
                 <w:sz w:val="16"/>
               </w:rPr>
-              <w:t>DAC Steering Summing Resistor, 11.0 kΩ, 0.1%</w:t>
+              <w:t>Voltage Feedback Attenuator Resistors, 49.9kΩ / 3.65kΩ, 0.1%</w:t>
             </w:r>
           </w:p>
         </w:tc>
@@ -40684,7 +40524,7 @@
                 <w:color w:val="1A202C"/>
                 <w:sz w:val="16"/>
               </w:rPr>
-              <w:t>1</w:t>
+              <w:t>2</w:t>
             </w:r>
           </w:p>
         </w:tc>
@@ -40771,7 +40611,7 @@
                 <w:color w:val="1A202C"/>
                 <w:sz w:val="16"/>
               </w:rPr>
-              <w:t>TNPW080511K0BEEA</w:t>
+              <w:t>TNPW080549K9BEEA</w:t>
             </w:r>
           </w:p>
         </w:tc>
@@ -44398,12 +44238,12 @@
         <w:pStyle w:val="Heading3"/>
       </w:pPr>
       <w:r>
-        <w:t>Q6: How does the DAC steer the output voltage without destabilizing the loop?</w:t>
+        <w:t>Q6: How does the Buck-Boost stage set and regulate output voltage based on PWM duty cycle?</w:t>
       </w:r>
     </w:p>
     <w:p>
       <w:r>
-        <w:t>The LM5176 regulates by maintaining its feedback pin (FB) at an internal 1.20V reference. Instead of modifying the internal reference, we use a resistive summing junction: R_top (49.9kΩ) connects to V_OUT, R_bot (3.65kΩ) connects to ground, and R_DAC (11.0kΩ) connects to our 12-bit DAC. By injecting current into the FB node from the DAC, when V_DAC = 3.3V, V_OUT is steered to 5.0V. When V_DAC = 0V, V_OUT is steered to 20.0V. Because the loop's AC Type-II compensation network is connected between COMP and ground, DC setpoint steering has zero impact on high-frequency phase margin and stability.</w:t>
+        <w:t>The post-regulator operates on the physical principle of switching duty cycle modulation: from the +24.0V intermediate bus, the buck-boost H-bridge switch timing determines the transfer function. For 5.0V to 18.0V, the stage operates in pure synchronous buck mode where V_OUT = D * V_IN (e.g. D = 20.8% for 5.0V, D = 50.0% for 12.0V, D = 62.5% for 15.0V). For 18.0V to 20.0V, the controller smoothly modulates buck and boost legs. The MCU directly calculates and commands the PWM duty cycle with high resolution, eliminating analog resistor summing networks or DAC injection circuits. Output voltage feedback is sampled cleanly by the 12-bit ADC through a standard passive attenuator divider for closed-loop software PID regulation and overvoltage clamping.</w:t>
       </w:r>
     </w:p>
     <w:p>

</xml_diff>